<commit_message>
fix(academic): actualizar denominacion y grado academico a Dr. Javier Eduardo Jaramillo Atoche (Doctor en TIC - SUNEDU)
</commit_message>
<xml_diff>
--- a/docs/Caso_Practico_Habilidades_Blandas_y_Duras_GersonPintado.docx
+++ b/docs/Caso_Practico_Habilidades_Blandas_y_Duras_GersonPintado.docx
@@ -191,12 +191,7 @@
               <w:spacing w:after="0"/>
             </w:pPr>
             <w:r>
-              <w:rPr>
-                <w:rFonts w:ascii="Arial" w:hAnsi="Arial"/>
-                <w:color w:val="334155"/>
-                <w:sz w:val="19"/>
-              </w:rPr>
-              <w:t>Prof. Javier Eduardo Jaramillo Atoche</w:t>
+              <w:t>Dr. Javier Eduardo Jaramillo Atoche</w:t>
             </w:r>
           </w:p>
         </w:tc>

</xml_diff>